<commit_message>
Add Section 5.7b: supplementary English document as document-length evidence
Reports the IICTNotice results (100% Hit@5, EM 60%/F1 0.918 with llama3-chatqa)
as supplementary evidence for the document-length interpretation of the English
gap already given in Sections 5.4-5.7, explicitly labeled as additional to (not
replacing) the canonical ten-document, 150-question evaluation.

Co-Authored-By: Claude Sonnet 5 <noreply@anthropic.com>
</commit_message>
<xml_diff>
--- a/thesis_full_draft.docx
+++ b/thesis_full_draft.docx
@@ -11276,6 +11276,424 @@
       </w:pPr>
       <w:r>
         <w:t xml:space="preserve">Strikingly, of the 75 total abstentions recorded across the entire evaluation, all 75 occur on a single document: the English-language DUETBooklet corpus (31.25% of its 240 evaluations), while every one of the other nine Bangla-language documents records zero abstentions. This is a clean, data-grounded confirmation that the system’s refusal behavior is overwhelmingly concentrated on the one corpus processed in a genuinely different regime (English content, English answer language, and – per Section 5.2 – a document-quality score the Bangla-oriented heuristic cannot meaningfully compute). The great majority of DUETBooklet’s abstentions (70 of 75) coincide with a genuine retrieval miss, which is the intended, correct use of the refusal mechanism; only 5 are false abstentions, where the gold chunk was retrieved but the system nonetheless declined to answer – a false-abstention rate of just 0.53% given a hit, indicating the strict-retry mechanism (Section 3.9) is largely, though not perfectly, effective at recovering from an initial false refusal.</w:t>
+      </w:r>
+    </w:p>
+    <w:p>
+      <w:pPr>
+        <w:pStyle w:val="Heading2"/>
+      </w:pPr>
+      <w:r>
+        <w:t>5.7b Supplementary Check: Is the English Gap About Language, or Document Length?</w:t>
+      </w:r>
+    </w:p>
+    <w:p>
+      <w:pPr>
+        <w:pStyle w:val="BodyText"/>
+      </w:pPr>
+      <w:r>
+        <w:t>Section 5.4-5.7 attribute DUETBooklet's comparatively weak retrieval (45.0% Hit@5) and abstention behavior to it being a large (33-page), dense, table-heavy single document rather than to English-language handling itself, but the original ten-document corpus contains only one English document, so that claim could not be cross-checked against a second English data point. During preparation of this evaluation, an unrelated defect was also found and fixed in the extraction pipeline: the native-versus-OCR page-selection logic (Section 3.3) was gated entirely on Bangla character count, so for a scanned English page - where neither candidate contains Bangla text - the algorithm had no signal to prefer a successful OCR extraction over a near-empty native one, silently discarding recovered text. A language-agnostic character-count fallback was added so that a candidate which actually recovered content is preferred when neither candidate contains Bangla text (src/docling_extractor.py). A second, related defect in the compact single-line table parser (src/text_processing.py) - which could mistake a table's own header/separator boundary for a data row on tables without a leading index column - was found and fixed at the same time.</w:t>
+      </w:r>
+    </w:p>
+    <w:p>
+      <w:pPr>
+        <w:pStyle w:val="BodyText"/>
+      </w:pPr>
+      <w:r>
+        <w:t>To test the document-length hypothesis directly, a short (1-page) English admission notice (IICTNotice) was added as an eleventh, supplementary document - evaluated separately from, and in addition to, the ten-document, 150-question canonical evaluation set used throughout this chapter, using 10 hand-verified questions grounded in its own extracted chunks, indexed under BAAI/bge-m3 and evaluated with both qwen2.5:3b-instruct and llama3-chatqa in both retrieval modes. Table 5.7b reports the result.</w:t>
+      </w:r>
+    </w:p>
+    <w:p>
+      <w:pPr>
+        <w:pStyle w:val="BodyText"/>
+      </w:pPr>
+      <w:r>
+        <w:rPr>
+          <w:b/>
+        </w:rPr>
+        <w:t>Table 5.7b: Supplementary English document (IICTNotice, 1 page, n = 10 questions per row), BAAI/bge-m3 embeddings.</w:t>
+      </w:r>
+    </w:p>
+    <w:tbl>
+      <w:tblPr>
+        <w:tblW w:type="auto" w:w="0"/>
+        <w:tblLook w:firstColumn="1" w:firstRow="1" w:lastColumn="0" w:lastRow="0" w:noHBand="0" w:noVBand="1" w:val="04A0"/>
+      </w:tblPr>
+      <w:tblGrid>
+        <w:gridCol w:w="1337"/>
+        <w:gridCol w:w="1337"/>
+        <w:gridCol w:w="1337"/>
+        <w:gridCol w:w="1337"/>
+        <w:gridCol w:w="1337"/>
+        <w:gridCol w:w="1337"/>
+        <w:gridCol w:w="1337"/>
+      </w:tblGrid>
+      <w:tr>
+        <w:tc>
+          <w:tcPr>
+            <w:tcW w:type="dxa" w:w="1337"/>
+          </w:tcPr>
+          <w:p>
+            <w:r>
+              <w:t>Generator</w:t>
+            </w:r>
+          </w:p>
+        </w:tc>
+        <w:tc>
+          <w:tcPr>
+            <w:tcW w:type="dxa" w:w="1337"/>
+          </w:tcPr>
+          <w:p>
+            <w:r>
+              <w:t>Mode</w:t>
+            </w:r>
+          </w:p>
+        </w:tc>
+        <w:tc>
+          <w:tcPr>
+            <w:tcW w:type="dxa" w:w="1337"/>
+          </w:tcPr>
+          <w:p>
+            <w:r>
+              <w:t>Retrieval Hit@5</w:t>
+            </w:r>
+          </w:p>
+        </w:tc>
+        <w:tc>
+          <w:tcPr>
+            <w:tcW w:type="dxa" w:w="1337"/>
+          </w:tcPr>
+          <w:p>
+            <w:r>
+              <w:t>Exact Match</w:t>
+            </w:r>
+          </w:p>
+        </w:tc>
+        <w:tc>
+          <w:tcPr>
+            <w:tcW w:type="dxa" w:w="1337"/>
+          </w:tcPr>
+          <w:p>
+            <w:r>
+              <w:t>Token F1</w:t>
+            </w:r>
+          </w:p>
+        </w:tc>
+        <w:tc>
+          <w:tcPr>
+            <w:tcW w:type="dxa" w:w="1337"/>
+          </w:tcPr>
+          <w:p>
+            <w:r>
+              <w:t>ROUGE-L</w:t>
+            </w:r>
+          </w:p>
+        </w:tc>
+        <w:tc>
+          <w:tcPr>
+            <w:tcW w:type="dxa" w:w="1337"/>
+          </w:tcPr>
+          <w:p>
+            <w:r>
+              <w:t>Semantic similarity</w:t>
+            </w:r>
+          </w:p>
+        </w:tc>
+      </w:tr>
+      <w:tr>
+        <w:tc>
+          <w:tcPr>
+            <w:tcW w:type="dxa" w:w="1337"/>
+          </w:tcPr>
+          <w:p>
+            <w:r>
+              <w:t>qwen2.5:3b-instruct</w:t>
+            </w:r>
+          </w:p>
+        </w:tc>
+        <w:tc>
+          <w:tcPr>
+            <w:tcW w:type="dxa" w:w="1337"/>
+          </w:tcPr>
+          <w:p>
+            <w:r>
+              <w:t>Direct</w:t>
+            </w:r>
+          </w:p>
+        </w:tc>
+        <w:tc>
+          <w:tcPr>
+            <w:tcW w:type="dxa" w:w="1337"/>
+          </w:tcPr>
+          <w:p>
+            <w:r>
+              <w:t>100%</w:t>
+            </w:r>
+          </w:p>
+        </w:tc>
+        <w:tc>
+          <w:tcPr>
+            <w:tcW w:type="dxa" w:w="1337"/>
+          </w:tcPr>
+          <w:p>
+            <w:r>
+              <w:t>0.00</w:t>
+            </w:r>
+          </w:p>
+        </w:tc>
+        <w:tc>
+          <w:tcPr>
+            <w:tcW w:type="dxa" w:w="1337"/>
+          </w:tcPr>
+          <w:p>
+            <w:r>
+              <w:t>0.219</w:t>
+            </w:r>
+          </w:p>
+        </w:tc>
+        <w:tc>
+          <w:tcPr>
+            <w:tcW w:type="dxa" w:w="1337"/>
+          </w:tcPr>
+          <w:p>
+            <w:r>
+              <w:t>0.219</w:t>
+            </w:r>
+          </w:p>
+        </w:tc>
+        <w:tc>
+          <w:tcPr>
+            <w:tcW w:type="dxa" w:w="1337"/>
+          </w:tcPr>
+          <w:p>
+            <w:r>
+              <w:t>0.599</w:t>
+            </w:r>
+          </w:p>
+        </w:tc>
+      </w:tr>
+      <w:tr>
+        <w:tc>
+          <w:tcPr>
+            <w:tcW w:type="dxa" w:w="1337"/>
+          </w:tcPr>
+          <w:p>
+            <w:r>
+              <w:t>qwen2.5:3b-instruct</w:t>
+            </w:r>
+          </w:p>
+        </w:tc>
+        <w:tc>
+          <w:tcPr>
+            <w:tcW w:type="dxa" w:w="1337"/>
+          </w:tcPr>
+          <w:p>
+            <w:r>
+              <w:t>Translated</w:t>
+            </w:r>
+          </w:p>
+        </w:tc>
+        <w:tc>
+          <w:tcPr>
+            <w:tcW w:type="dxa" w:w="1337"/>
+          </w:tcPr>
+          <w:p>
+            <w:r>
+              <w:t>100%</w:t>
+            </w:r>
+          </w:p>
+        </w:tc>
+        <w:tc>
+          <w:tcPr>
+            <w:tcW w:type="dxa" w:w="1337"/>
+          </w:tcPr>
+          <w:p>
+            <w:r>
+              <w:t>0.00</w:t>
+            </w:r>
+          </w:p>
+        </w:tc>
+        <w:tc>
+          <w:tcPr>
+            <w:tcW w:type="dxa" w:w="1337"/>
+          </w:tcPr>
+          <w:p>
+            <w:r>
+              <w:t>0.269</w:t>
+            </w:r>
+          </w:p>
+        </w:tc>
+        <w:tc>
+          <w:tcPr>
+            <w:tcW w:type="dxa" w:w="1337"/>
+          </w:tcPr>
+          <w:p>
+            <w:r>
+              <w:t>0.269</w:t>
+            </w:r>
+          </w:p>
+        </w:tc>
+        <w:tc>
+          <w:tcPr>
+            <w:tcW w:type="dxa" w:w="1337"/>
+          </w:tcPr>
+          <w:p>
+            <w:r>
+              <w:t>0.615</w:t>
+            </w:r>
+          </w:p>
+        </w:tc>
+      </w:tr>
+      <w:tr>
+        <w:tc>
+          <w:tcPr>
+            <w:tcW w:type="dxa" w:w="1337"/>
+          </w:tcPr>
+          <w:p>
+            <w:r>
+              <w:t>llama3-chatqa</w:t>
+            </w:r>
+          </w:p>
+        </w:tc>
+        <w:tc>
+          <w:tcPr>
+            <w:tcW w:type="dxa" w:w="1337"/>
+          </w:tcPr>
+          <w:p>
+            <w:r>
+              <w:t>Direct</w:t>
+            </w:r>
+          </w:p>
+        </w:tc>
+        <w:tc>
+          <w:tcPr>
+            <w:tcW w:type="dxa" w:w="1337"/>
+          </w:tcPr>
+          <w:p>
+            <w:r>
+              <w:t>100%</w:t>
+            </w:r>
+          </w:p>
+        </w:tc>
+        <w:tc>
+          <w:tcPr>
+            <w:tcW w:type="dxa" w:w="1337"/>
+          </w:tcPr>
+          <w:p>
+            <w:r>
+              <w:t>0.60</w:t>
+            </w:r>
+          </w:p>
+        </w:tc>
+        <w:tc>
+          <w:tcPr>
+            <w:tcW w:type="dxa" w:w="1337"/>
+          </w:tcPr>
+          <w:p>
+            <w:r>
+              <w:t>0.918</w:t>
+            </w:r>
+          </w:p>
+        </w:tc>
+        <w:tc>
+          <w:tcPr>
+            <w:tcW w:type="dxa" w:w="1337"/>
+          </w:tcPr>
+          <w:p>
+            <w:r>
+              <w:t>0.893</w:t>
+            </w:r>
+          </w:p>
+        </w:tc>
+        <w:tc>
+          <w:tcPr>
+            <w:tcW w:type="dxa" w:w="1337"/>
+          </w:tcPr>
+          <w:p>
+            <w:r>
+              <w:t>0.954</w:t>
+            </w:r>
+          </w:p>
+        </w:tc>
+      </w:tr>
+      <w:tr>
+        <w:tc>
+          <w:tcPr>
+            <w:tcW w:type="dxa" w:w="1337"/>
+          </w:tcPr>
+          <w:p>
+            <w:r>
+              <w:t>llama3-chatqa</w:t>
+            </w:r>
+          </w:p>
+        </w:tc>
+        <w:tc>
+          <w:tcPr>
+            <w:tcW w:type="dxa" w:w="1337"/>
+          </w:tcPr>
+          <w:p>
+            <w:r>
+              <w:t>Translated</w:t>
+            </w:r>
+          </w:p>
+        </w:tc>
+        <w:tc>
+          <w:tcPr>
+            <w:tcW w:type="dxa" w:w="1337"/>
+          </w:tcPr>
+          <w:p>
+            <w:r>
+              <w:t>100%</w:t>
+            </w:r>
+          </w:p>
+        </w:tc>
+        <w:tc>
+          <w:tcPr>
+            <w:tcW w:type="dxa" w:w="1337"/>
+          </w:tcPr>
+          <w:p>
+            <w:r>
+              <w:t>0.60</w:t>
+            </w:r>
+          </w:p>
+        </w:tc>
+        <w:tc>
+          <w:tcPr>
+            <w:tcW w:type="dxa" w:w="1337"/>
+          </w:tcPr>
+          <w:p>
+            <w:r>
+              <w:t>0.918</w:t>
+            </w:r>
+          </w:p>
+        </w:tc>
+        <w:tc>
+          <w:tcPr>
+            <w:tcW w:type="dxa" w:w="1337"/>
+          </w:tcPr>
+          <w:p>
+            <w:r>
+              <w:t>0.893</w:t>
+            </w:r>
+          </w:p>
+        </w:tc>
+        <w:tc>
+          <w:tcPr>
+            <w:tcW w:type="dxa" w:w="1337"/>
+          </w:tcPr>
+          <w:p>
+            <w:r>
+              <w:t>0.954</w:t>
+            </w:r>
+          </w:p>
+        </w:tc>
+      </w:tr>
+    </w:tbl>
+    <w:p>
+      <w:pPr>
+        <w:pStyle w:val="BodyText"/>
+      </w:pPr>
+      <w:r>
+        <w:t>Retrieval Hit@5 is 100% for this document under both generators and both modes - markedly higher than DUETBooklet's 45.0% - and, using the recommended pipeline (llama3-chatqa), Exact Match reaches 60% with token F1 of 0.918, both far above any other configuration reported in this chapter. This single supplementary document cannot, on its own, prove the English-language gap is purely a document-length effect - ten questions on one one-page notice is a small, favorable case, and it is reported here as exactly that: supplementary, not a replacement for the canonical DUETBooklet result. But it is consistent with, and adds direct evidence for, the interpretation already given in Section 5.4-5.7: this system's English-language handling itself is not the limitation - retrieval scaling to long, dense, single documents is. It also demonstrates, concretely, the value of the two extraction fixes made alongside it: before the native/OCR page-selection fix, this same document produced zero usable text chunks and would have scored 0% on every metric above.</w:t>
       </w:r>
     </w:p>
     <w:bookmarkEnd w:id="67"/>

</xml_diff>

<commit_message>
Add Appendix C: sensitivity analysis excluding DUETBooklet (labeled, not canonical)
Full IICTNotice index built across all 5 embedding models to match the
canonical structure, plus retrieval/generation sweeps. Appendix C reports
retrieval, generation, and confusion-matrix tables with DUETBooklet excluded
and IICTNotice included instead, explicitly labeled as a sensitivity check
alongside (not replacing) the canonical Chapter 5 results, which still
include DUETBooklet.

Co-Authored-By: Claude Sonnet 5 <noreply@anthropic.com>
</commit_message>
<xml_diff>
--- a/thesis_full_draft.docx
+++ b/thesis_full_draft.docx
@@ -18839,6 +18839,1372 @@
       </w:r>
       <w:r>
         <w:t xml:space="preserve">, so that every number, table, and case study in Chapter 5 can be independently re-derived or extended.</w:t>
+      </w:r>
+    </w:p>
+    <w:p>
+      <w:pPr>
+        <w:pStyle w:val="Heading1"/>
+      </w:pPr>
+      <w:r>
+        <w:t>Appendix C: Sensitivity Analysis - Evaluation With DUETBooklet Excluded</w:t>
+      </w:r>
+    </w:p>
+    <w:p>
+      <w:pPr>
+        <w:pStyle w:val="FirstParagraph"/>
+      </w:pPr>
+      <w:r>
+        <w:t>This appendix is a labeled sensitivity check, not a replacement for the canonical ten-document, 150-question evaluation reported in Chapter 5. It recomputes the retrieval, generation, and confusion-matrix tables with DUETBooklet (the 33-page English booklet) removed and IICTNotice (the 1-page supplementary English document introduced in Section 5.7b) included in its place, using the same 5-embedding-model x 2-mode structure. It answers a specific, narrow question - what do the headline numbers look like if the harder English document is swapped for an easier one - and is reported transparently as exactly that, so a reader can see both the honest canonical result and this alternative side by side, rather than either being hidden.</w:t>
+      </w:r>
+    </w:p>
+    <w:p>
+      <w:pPr>
+        <w:pStyle w:val="FirstParagraph"/>
+      </w:pPr>
+      <w:r>
+        <w:rPr>
+          <w:b/>
+        </w:rPr>
+        <w:t>Table C.1: Retrieval performance, 9 Bangla documents + IICTNotice (n = 136 per row), top-k = 5.</w:t>
+      </w:r>
+    </w:p>
+    <w:tbl>
+      <w:tblPr>
+        <w:tblW w:type="auto" w:w="0"/>
+        <w:tblLook w:firstColumn="1" w:firstRow="1" w:lastColumn="0" w:lastRow="0" w:noHBand="0" w:noVBand="1" w:val="04A0"/>
+      </w:tblPr>
+      <w:tblGrid>
+        <w:gridCol w:w="1560"/>
+        <w:gridCol w:w="1560"/>
+        <w:gridCol w:w="1560"/>
+        <w:gridCol w:w="1560"/>
+        <w:gridCol w:w="1560"/>
+        <w:gridCol w:w="1560"/>
+      </w:tblGrid>
+      <w:tr>
+        <w:tc>
+          <w:tcPr>
+            <w:tcW w:type="dxa" w:w="1560"/>
+          </w:tcPr>
+          <w:p>
+            <w:r>
+              <w:t>Embedding model</w:t>
+            </w:r>
+          </w:p>
+        </w:tc>
+        <w:tc>
+          <w:tcPr>
+            <w:tcW w:type="dxa" w:w="1560"/>
+          </w:tcPr>
+          <w:p>
+            <w:r>
+              <w:t>Mode</w:t>
+            </w:r>
+          </w:p>
+        </w:tc>
+        <w:tc>
+          <w:tcPr>
+            <w:tcW w:type="dxa" w:w="1560"/>
+          </w:tcPr>
+          <w:p>
+            <w:r>
+              <w:t>Hit@1</w:t>
+            </w:r>
+          </w:p>
+        </w:tc>
+        <w:tc>
+          <w:tcPr>
+            <w:tcW w:type="dxa" w:w="1560"/>
+          </w:tcPr>
+          <w:p>
+            <w:r>
+              <w:t>Hit@3</w:t>
+            </w:r>
+          </w:p>
+        </w:tc>
+        <w:tc>
+          <w:tcPr>
+            <w:tcW w:type="dxa" w:w="1560"/>
+          </w:tcPr>
+          <w:p>
+            <w:r>
+              <w:t>Hit@5</w:t>
+            </w:r>
+          </w:p>
+        </w:tc>
+        <w:tc>
+          <w:tcPr>
+            <w:tcW w:type="dxa" w:w="1560"/>
+          </w:tcPr>
+          <w:p>
+            <w:r>
+              <w:t>MRR</w:t>
+            </w:r>
+          </w:p>
+        </w:tc>
+      </w:tr>
+      <w:tr>
+        <w:tc>
+          <w:tcPr>
+            <w:tcW w:type="dxa" w:w="1560"/>
+          </w:tcPr>
+          <w:p>
+            <w:r>
+              <w:t>BAAI/bge-m3</w:t>
+            </w:r>
+          </w:p>
+        </w:tc>
+        <w:tc>
+          <w:tcPr>
+            <w:tcW w:type="dxa" w:w="1560"/>
+          </w:tcPr>
+          <w:p>
+            <w:r>
+              <w:t>Direct</w:t>
+            </w:r>
+          </w:p>
+        </w:tc>
+        <w:tc>
+          <w:tcPr>
+            <w:tcW w:type="dxa" w:w="1560"/>
+          </w:tcPr>
+          <w:p>
+            <w:r>
+              <w:t>0.500</w:t>
+            </w:r>
+          </w:p>
+        </w:tc>
+        <w:tc>
+          <w:tcPr>
+            <w:tcW w:type="dxa" w:w="1560"/>
+          </w:tcPr>
+          <w:p>
+            <w:r>
+              <w:t>0.743</w:t>
+            </w:r>
+          </w:p>
+        </w:tc>
+        <w:tc>
+          <w:tcPr>
+            <w:tcW w:type="dxa" w:w="1560"/>
+          </w:tcPr>
+          <w:p>
+            <w:r>
+              <w:t>0.838</w:t>
+            </w:r>
+          </w:p>
+        </w:tc>
+        <w:tc>
+          <w:tcPr>
+            <w:tcW w:type="dxa" w:w="1560"/>
+          </w:tcPr>
+          <w:p>
+            <w:r>
+              <w:t>0.636</w:t>
+            </w:r>
+          </w:p>
+        </w:tc>
+      </w:tr>
+      <w:tr>
+        <w:tc>
+          <w:tcPr>
+            <w:tcW w:type="dxa" w:w="1560"/>
+          </w:tcPr>
+          <w:p>
+            <w:r>
+              <w:t>BAAI/bge-m3</w:t>
+            </w:r>
+          </w:p>
+        </w:tc>
+        <w:tc>
+          <w:tcPr>
+            <w:tcW w:type="dxa" w:w="1560"/>
+          </w:tcPr>
+          <w:p>
+            <w:r>
+              <w:t>Translated</w:t>
+            </w:r>
+          </w:p>
+        </w:tc>
+        <w:tc>
+          <w:tcPr>
+            <w:tcW w:type="dxa" w:w="1560"/>
+          </w:tcPr>
+          <w:p>
+            <w:r>
+              <w:t>0.441</w:t>
+            </w:r>
+          </w:p>
+        </w:tc>
+        <w:tc>
+          <w:tcPr>
+            <w:tcW w:type="dxa" w:w="1560"/>
+          </w:tcPr>
+          <w:p>
+            <w:r>
+              <w:t>0.713</w:t>
+            </w:r>
+          </w:p>
+        </w:tc>
+        <w:tc>
+          <w:tcPr>
+            <w:tcW w:type="dxa" w:w="1560"/>
+          </w:tcPr>
+          <w:p>
+            <w:r>
+              <w:t>0.802</w:t>
+            </w:r>
+          </w:p>
+        </w:tc>
+        <w:tc>
+          <w:tcPr>
+            <w:tcW w:type="dxa" w:w="1560"/>
+          </w:tcPr>
+          <w:p>
+            <w:r>
+              <w:t>0.583</w:t>
+            </w:r>
+          </w:p>
+        </w:tc>
+      </w:tr>
+      <w:tr>
+        <w:tc>
+          <w:tcPr>
+            <w:tcW w:type="dxa" w:w="1560"/>
+          </w:tcPr>
+          <w:p>
+            <w:r>
+              <w:t>intfloat/multilingual-e5-base</w:t>
+            </w:r>
+          </w:p>
+        </w:tc>
+        <w:tc>
+          <w:tcPr>
+            <w:tcW w:type="dxa" w:w="1560"/>
+          </w:tcPr>
+          <w:p>
+            <w:r>
+              <w:t>Direct</w:t>
+            </w:r>
+          </w:p>
+        </w:tc>
+        <w:tc>
+          <w:tcPr>
+            <w:tcW w:type="dxa" w:w="1560"/>
+          </w:tcPr>
+          <w:p>
+            <w:r>
+              <w:t>0.500</w:t>
+            </w:r>
+          </w:p>
+        </w:tc>
+        <w:tc>
+          <w:tcPr>
+            <w:tcW w:type="dxa" w:w="1560"/>
+          </w:tcPr>
+          <w:p>
+            <w:r>
+              <w:t>0.699</w:t>
+            </w:r>
+          </w:p>
+        </w:tc>
+        <w:tc>
+          <w:tcPr>
+            <w:tcW w:type="dxa" w:w="1560"/>
+          </w:tcPr>
+          <w:p>
+            <w:r>
+              <w:t>0.772</w:t>
+            </w:r>
+          </w:p>
+        </w:tc>
+        <w:tc>
+          <w:tcPr>
+            <w:tcW w:type="dxa" w:w="1560"/>
+          </w:tcPr>
+          <w:p>
+            <w:r>
+              <w:t>0.607</w:t>
+            </w:r>
+          </w:p>
+        </w:tc>
+      </w:tr>
+      <w:tr>
+        <w:tc>
+          <w:tcPr>
+            <w:tcW w:type="dxa" w:w="1560"/>
+          </w:tcPr>
+          <w:p>
+            <w:r>
+              <w:t>intfloat/multilingual-e5-base</w:t>
+            </w:r>
+          </w:p>
+        </w:tc>
+        <w:tc>
+          <w:tcPr>
+            <w:tcW w:type="dxa" w:w="1560"/>
+          </w:tcPr>
+          <w:p>
+            <w:r>
+              <w:t>Translated</w:t>
+            </w:r>
+          </w:p>
+        </w:tc>
+        <w:tc>
+          <w:tcPr>
+            <w:tcW w:type="dxa" w:w="1560"/>
+          </w:tcPr>
+          <w:p>
+            <w:r>
+              <w:t>0.346</w:t>
+            </w:r>
+          </w:p>
+        </w:tc>
+        <w:tc>
+          <w:tcPr>
+            <w:tcW w:type="dxa" w:w="1560"/>
+          </w:tcPr>
+          <w:p>
+            <w:r>
+              <w:t>0.618</w:t>
+            </w:r>
+          </w:p>
+        </w:tc>
+        <w:tc>
+          <w:tcPr>
+            <w:tcW w:type="dxa" w:w="1560"/>
+          </w:tcPr>
+          <w:p>
+            <w:r>
+              <w:t>0.691</w:t>
+            </w:r>
+          </w:p>
+        </w:tc>
+        <w:tc>
+          <w:tcPr>
+            <w:tcW w:type="dxa" w:w="1560"/>
+          </w:tcPr>
+          <w:p>
+            <w:r>
+              <w:t>0.488</w:t>
+            </w:r>
+          </w:p>
+        </w:tc>
+      </w:tr>
+      <w:tr>
+        <w:tc>
+          <w:tcPr>
+            <w:tcW w:type="dxa" w:w="1560"/>
+          </w:tcPr>
+          <w:p>
+            <w:r>
+              <w:t>nomic-embed-text-v2-moe</w:t>
+            </w:r>
+          </w:p>
+        </w:tc>
+        <w:tc>
+          <w:tcPr>
+            <w:tcW w:type="dxa" w:w="1560"/>
+          </w:tcPr>
+          <w:p>
+            <w:r>
+              <w:t>Direct</w:t>
+            </w:r>
+          </w:p>
+        </w:tc>
+        <w:tc>
+          <w:tcPr>
+            <w:tcW w:type="dxa" w:w="1560"/>
+          </w:tcPr>
+          <w:p>
+            <w:r>
+              <w:t>0.338</w:t>
+            </w:r>
+          </w:p>
+        </w:tc>
+        <w:tc>
+          <w:tcPr>
+            <w:tcW w:type="dxa" w:w="1560"/>
+          </w:tcPr>
+          <w:p>
+            <w:r>
+              <w:t>0.647</w:t>
+            </w:r>
+          </w:p>
+        </w:tc>
+        <w:tc>
+          <w:tcPr>
+            <w:tcW w:type="dxa" w:w="1560"/>
+          </w:tcPr>
+          <w:p>
+            <w:r>
+              <w:t>0.743</w:t>
+            </w:r>
+          </w:p>
+        </w:tc>
+        <w:tc>
+          <w:tcPr>
+            <w:tcW w:type="dxa" w:w="1560"/>
+          </w:tcPr>
+          <w:p>
+            <w:r>
+              <w:t>0.497</w:t>
+            </w:r>
+          </w:p>
+        </w:tc>
+      </w:tr>
+      <w:tr>
+        <w:tc>
+          <w:tcPr>
+            <w:tcW w:type="dxa" w:w="1560"/>
+          </w:tcPr>
+          <w:p>
+            <w:r>
+              <w:t>nomic-embed-text-v2-moe</w:t>
+            </w:r>
+          </w:p>
+        </w:tc>
+        <w:tc>
+          <w:tcPr>
+            <w:tcW w:type="dxa" w:w="1560"/>
+          </w:tcPr>
+          <w:p>
+            <w:r>
+              <w:t>Translated</w:t>
+            </w:r>
+          </w:p>
+        </w:tc>
+        <w:tc>
+          <w:tcPr>
+            <w:tcW w:type="dxa" w:w="1560"/>
+          </w:tcPr>
+          <w:p>
+            <w:r>
+              <w:t>0.287</w:t>
+            </w:r>
+          </w:p>
+        </w:tc>
+        <w:tc>
+          <w:tcPr>
+            <w:tcW w:type="dxa" w:w="1560"/>
+          </w:tcPr>
+          <w:p>
+            <w:r>
+              <w:t>0.559</w:t>
+            </w:r>
+          </w:p>
+        </w:tc>
+        <w:tc>
+          <w:tcPr>
+            <w:tcW w:type="dxa" w:w="1560"/>
+          </w:tcPr>
+          <w:p>
+            <w:r>
+              <w:t>0.691</w:t>
+            </w:r>
+          </w:p>
+        </w:tc>
+        <w:tc>
+          <w:tcPr>
+            <w:tcW w:type="dxa" w:w="1560"/>
+          </w:tcPr>
+          <w:p>
+            <w:r>
+              <w:t>0.437</w:t>
+            </w:r>
+          </w:p>
+        </w:tc>
+      </w:tr>
+      <w:tr>
+        <w:tc>
+          <w:tcPr>
+            <w:tcW w:type="dxa" w:w="1560"/>
+          </w:tcPr>
+          <w:p>
+            <w:r>
+              <w:t>paraphrase-multilingual-mpnet-base-v2</w:t>
+            </w:r>
+          </w:p>
+        </w:tc>
+        <w:tc>
+          <w:tcPr>
+            <w:tcW w:type="dxa" w:w="1560"/>
+          </w:tcPr>
+          <w:p>
+            <w:r>
+              <w:t>Direct</w:t>
+            </w:r>
+          </w:p>
+        </w:tc>
+        <w:tc>
+          <w:tcPr>
+            <w:tcW w:type="dxa" w:w="1560"/>
+          </w:tcPr>
+          <w:p>
+            <w:r>
+              <w:t>0.140</w:t>
+            </w:r>
+          </w:p>
+        </w:tc>
+        <w:tc>
+          <w:tcPr>
+            <w:tcW w:type="dxa" w:w="1560"/>
+          </w:tcPr>
+          <w:p>
+            <w:r>
+              <w:t>0.404</w:t>
+            </w:r>
+          </w:p>
+        </w:tc>
+        <w:tc>
+          <w:tcPr>
+            <w:tcW w:type="dxa" w:w="1560"/>
+          </w:tcPr>
+          <w:p>
+            <w:r>
+              <w:t>0.544</w:t>
+            </w:r>
+          </w:p>
+        </w:tc>
+        <w:tc>
+          <w:tcPr>
+            <w:tcW w:type="dxa" w:w="1560"/>
+          </w:tcPr>
+          <w:p>
+            <w:r>
+              <w:t>0.282</w:t>
+            </w:r>
+          </w:p>
+        </w:tc>
+      </w:tr>
+      <w:tr>
+        <w:tc>
+          <w:tcPr>
+            <w:tcW w:type="dxa" w:w="1560"/>
+          </w:tcPr>
+          <w:p>
+            <w:r>
+              <w:t>paraphrase-multilingual-mpnet-base-v2</w:t>
+            </w:r>
+          </w:p>
+        </w:tc>
+        <w:tc>
+          <w:tcPr>
+            <w:tcW w:type="dxa" w:w="1560"/>
+          </w:tcPr>
+          <w:p>
+            <w:r>
+              <w:t>Translated</w:t>
+            </w:r>
+          </w:p>
+        </w:tc>
+        <w:tc>
+          <w:tcPr>
+            <w:tcW w:type="dxa" w:w="1560"/>
+          </w:tcPr>
+          <w:p>
+            <w:r>
+              <w:t>0.272</w:t>
+            </w:r>
+          </w:p>
+        </w:tc>
+        <w:tc>
+          <w:tcPr>
+            <w:tcW w:type="dxa" w:w="1560"/>
+          </w:tcPr>
+          <w:p>
+            <w:r>
+              <w:t>0.515</w:t>
+            </w:r>
+          </w:p>
+        </w:tc>
+        <w:tc>
+          <w:tcPr>
+            <w:tcW w:type="dxa" w:w="1560"/>
+          </w:tcPr>
+          <w:p>
+            <w:r>
+              <w:t>0.603</w:t>
+            </w:r>
+          </w:p>
+        </w:tc>
+        <w:tc>
+          <w:tcPr>
+            <w:tcW w:type="dxa" w:w="1560"/>
+          </w:tcPr>
+          <w:p>
+            <w:r>
+              <w:t>0.397</w:t>
+            </w:r>
+          </w:p>
+        </w:tc>
+      </w:tr>
+      <w:tr>
+        <w:tc>
+          <w:tcPr>
+            <w:tcW w:type="dxa" w:w="1560"/>
+          </w:tcPr>
+          <w:p>
+            <w:r>
+              <w:t>paraphrase-multilingual-MiniLM-L12-v2</w:t>
+            </w:r>
+          </w:p>
+        </w:tc>
+        <w:tc>
+          <w:tcPr>
+            <w:tcW w:type="dxa" w:w="1560"/>
+          </w:tcPr>
+          <w:p>
+            <w:r>
+              <w:t>Direct</w:t>
+            </w:r>
+          </w:p>
+        </w:tc>
+        <w:tc>
+          <w:tcPr>
+            <w:tcW w:type="dxa" w:w="1560"/>
+          </w:tcPr>
+          <w:p>
+            <w:r>
+              <w:t>0.110</w:t>
+            </w:r>
+          </w:p>
+        </w:tc>
+        <w:tc>
+          <w:tcPr>
+            <w:tcW w:type="dxa" w:w="1560"/>
+          </w:tcPr>
+          <w:p>
+            <w:r>
+              <w:t>0.199</w:t>
+            </w:r>
+          </w:p>
+        </w:tc>
+        <w:tc>
+          <w:tcPr>
+            <w:tcW w:type="dxa" w:w="1560"/>
+          </w:tcPr>
+          <w:p>
+            <w:r>
+              <w:t>0.412</w:t>
+            </w:r>
+          </w:p>
+        </w:tc>
+        <w:tc>
+          <w:tcPr>
+            <w:tcW w:type="dxa" w:w="1560"/>
+          </w:tcPr>
+          <w:p>
+            <w:r>
+              <w:t>0.199</w:t>
+            </w:r>
+          </w:p>
+        </w:tc>
+      </w:tr>
+      <w:tr>
+        <w:tc>
+          <w:tcPr>
+            <w:tcW w:type="dxa" w:w="1560"/>
+          </w:tcPr>
+          <w:p>
+            <w:r>
+              <w:t>paraphrase-multilingual-MiniLM-L12-v2</w:t>
+            </w:r>
+          </w:p>
+        </w:tc>
+        <w:tc>
+          <w:tcPr>
+            <w:tcW w:type="dxa" w:w="1560"/>
+          </w:tcPr>
+          <w:p>
+            <w:r>
+              <w:t>Translated</w:t>
+            </w:r>
+          </w:p>
+        </w:tc>
+        <w:tc>
+          <w:tcPr>
+            <w:tcW w:type="dxa" w:w="1560"/>
+          </w:tcPr>
+          <w:p>
+            <w:r>
+              <w:t>0.324</w:t>
+            </w:r>
+          </w:p>
+        </w:tc>
+        <w:tc>
+          <w:tcPr>
+            <w:tcW w:type="dxa" w:w="1560"/>
+          </w:tcPr>
+          <w:p>
+            <w:r>
+              <w:t>0.566</w:t>
+            </w:r>
+          </w:p>
+        </w:tc>
+        <w:tc>
+          <w:tcPr>
+            <w:tcW w:type="dxa" w:w="1560"/>
+          </w:tcPr>
+          <w:p>
+            <w:r>
+              <w:t>0.677</w:t>
+            </w:r>
+          </w:p>
+        </w:tc>
+        <w:tc>
+          <w:tcPr>
+            <w:tcW w:type="dxa" w:w="1560"/>
+          </w:tcPr>
+          <w:p>
+            <w:r>
+              <w:t>0.454</w:t>
+            </w:r>
+          </w:p>
+        </w:tc>
+      </w:tr>
+    </w:tbl>
+    <w:p>
+      <w:pPr>
+        <w:pStyle w:val="FirstParagraph"/>
+      </w:pPr>
+      <w:r>
+        <w:t>BAAI/bge-m3 direct-mode Hit@1 rises from 0.480 (canonical, Table 5.2) to 0.500, and Hit@5 rises from 0.767 to 0.838, under this substitution - a real but modest improvement, not a transformative one; the embedding-model ranking and the direct-vs-translated pattern by model family (Section 5.4) are unchanged.</w:t>
+      </w:r>
+    </w:p>
+    <w:p>
+      <w:pPr>
+        <w:pStyle w:val="FirstParagraph"/>
+      </w:pPr>
+      <w:r>
+        <w:rPr>
+          <w:b/>
+        </w:rPr>
+        <w:t>Table C.2: Generation quality, 9 Bangla documents + IICTNotice, pooled across five embedding models (n = 680 per mode).</w:t>
+      </w:r>
+    </w:p>
+    <w:tbl>
+      <w:tblPr>
+        <w:tblW w:type="auto" w:w="0"/>
+        <w:tblLook w:firstColumn="1" w:firstRow="1" w:lastColumn="0" w:lastRow="0" w:noHBand="0" w:noVBand="1" w:val="04A0"/>
+      </w:tblPr>
+      <w:tblGrid>
+        <w:gridCol w:w="1560"/>
+        <w:gridCol w:w="1560"/>
+        <w:gridCol w:w="1560"/>
+        <w:gridCol w:w="1560"/>
+        <w:gridCol w:w="1560"/>
+        <w:gridCol w:w="1560"/>
+      </w:tblGrid>
+      <w:tr>
+        <w:tc>
+          <w:tcPr>
+            <w:tcW w:type="dxa" w:w="1560"/>
+          </w:tcPr>
+          <w:p>
+            <w:r>
+              <w:t>Configuration</w:t>
+            </w:r>
+          </w:p>
+        </w:tc>
+        <w:tc>
+          <w:tcPr>
+            <w:tcW w:type="dxa" w:w="1560"/>
+          </w:tcPr>
+          <w:p>
+            <w:r>
+              <w:t>Mode</w:t>
+            </w:r>
+          </w:p>
+        </w:tc>
+        <w:tc>
+          <w:tcPr>
+            <w:tcW w:type="dxa" w:w="1560"/>
+          </w:tcPr>
+          <w:p>
+            <w:r>
+              <w:t>Exact Match</w:t>
+            </w:r>
+          </w:p>
+        </w:tc>
+        <w:tc>
+          <w:tcPr>
+            <w:tcW w:type="dxa" w:w="1560"/>
+          </w:tcPr>
+          <w:p>
+            <w:r>
+              <w:t>Token F1</w:t>
+            </w:r>
+          </w:p>
+        </w:tc>
+        <w:tc>
+          <w:tcPr>
+            <w:tcW w:type="dxa" w:w="1560"/>
+          </w:tcPr>
+          <w:p>
+            <w:r>
+              <w:t>Keyword recall</w:t>
+            </w:r>
+          </w:p>
+        </w:tc>
+        <w:tc>
+          <w:tcPr>
+            <w:tcW w:type="dxa" w:w="1560"/>
+          </w:tcPr>
+          <w:p>
+            <w:r>
+              <w:t>Retrieval Hit@5</w:t>
+            </w:r>
+          </w:p>
+        </w:tc>
+      </w:tr>
+      <w:tr>
+        <w:tc>
+          <w:tcPr>
+            <w:tcW w:type="dxa" w:w="1560"/>
+          </w:tcPr>
+          <w:p>
+            <w:r>
+              <w:t>Primary (qwen2.5:3b, pooled 5 models)</w:t>
+            </w:r>
+          </w:p>
+        </w:tc>
+        <w:tc>
+          <w:tcPr>
+            <w:tcW w:type="dxa" w:w="1560"/>
+          </w:tcPr>
+          <w:p>
+            <w:r>
+              <w:t>Direct</w:t>
+            </w:r>
+          </w:p>
+        </w:tc>
+        <w:tc>
+          <w:tcPr>
+            <w:tcW w:type="dxa" w:w="1560"/>
+          </w:tcPr>
+          <w:p>
+            <w:r>
+              <w:t>0.015</w:t>
+            </w:r>
+          </w:p>
+        </w:tc>
+        <w:tc>
+          <w:tcPr>
+            <w:tcW w:type="dxa" w:w="1560"/>
+          </w:tcPr>
+          <w:p>
+            <w:r>
+              <w:t>0.142</w:t>
+            </w:r>
+          </w:p>
+        </w:tc>
+        <w:tc>
+          <w:tcPr>
+            <w:tcW w:type="dxa" w:w="1560"/>
+          </w:tcPr>
+          <w:p>
+            <w:r>
+              <w:t>30.6%</w:t>
+            </w:r>
+          </w:p>
+        </w:tc>
+        <w:tc>
+          <w:tcPr>
+            <w:tcW w:type="dxa" w:w="1560"/>
+          </w:tcPr>
+          <w:p>
+            <w:r>
+              <w:t>66.2%</w:t>
+            </w:r>
+          </w:p>
+        </w:tc>
+      </w:tr>
+      <w:tr>
+        <w:tc>
+          <w:tcPr>
+            <w:tcW w:type="dxa" w:w="1560"/>
+          </w:tcPr>
+          <w:p>
+            <w:r>
+              <w:t>Primary (qwen2.5:3b, pooled 5 models)</w:t>
+            </w:r>
+          </w:p>
+        </w:tc>
+        <w:tc>
+          <w:tcPr>
+            <w:tcW w:type="dxa" w:w="1560"/>
+          </w:tcPr>
+          <w:p>
+            <w:r>
+              <w:t>Translated</w:t>
+            </w:r>
+          </w:p>
+        </w:tc>
+        <w:tc>
+          <w:tcPr>
+            <w:tcW w:type="dxa" w:w="1560"/>
+          </w:tcPr>
+          <w:p>
+            <w:r>
+              <w:t>0.016</w:t>
+            </w:r>
+          </w:p>
+        </w:tc>
+        <w:tc>
+          <w:tcPr>
+            <w:tcW w:type="dxa" w:w="1560"/>
+          </w:tcPr>
+          <w:p>
+            <w:r>
+              <w:t>0.158</w:t>
+            </w:r>
+          </w:p>
+        </w:tc>
+        <w:tc>
+          <w:tcPr>
+            <w:tcW w:type="dxa" w:w="1560"/>
+          </w:tcPr>
+          <w:p>
+            <w:r>
+              <w:t>33.6%</w:t>
+            </w:r>
+          </w:p>
+        </w:tc>
+        <w:tc>
+          <w:tcPr>
+            <w:tcW w:type="dxa" w:w="1560"/>
+          </w:tcPr>
+          <w:p>
+            <w:r>
+              <w:t>69.3%</w:t>
+            </w:r>
+          </w:p>
+        </w:tc>
+      </w:tr>
+      <w:tr>
+        <w:tc>
+          <w:tcPr>
+            <w:tcW w:type="dxa" w:w="1560"/>
+          </w:tcPr>
+          <w:p>
+            <w:r>
+              <w:t>Recommended (bge-m3 + llama3-chatqa)</w:t>
+            </w:r>
+          </w:p>
+        </w:tc>
+        <w:tc>
+          <w:tcPr>
+            <w:tcW w:type="dxa" w:w="1560"/>
+          </w:tcPr>
+          <w:p>
+            <w:r>
+              <w:t>Direct</w:t>
+            </w:r>
+          </w:p>
+        </w:tc>
+        <w:tc>
+          <w:tcPr>
+            <w:tcW w:type="dxa" w:w="1560"/>
+          </w:tcPr>
+          <w:p>
+            <w:r>
+              <w:t>0.132</w:t>
+            </w:r>
+          </w:p>
+        </w:tc>
+        <w:tc>
+          <w:tcPr>
+            <w:tcW w:type="dxa" w:w="1560"/>
+          </w:tcPr>
+          <w:p>
+            <w:r>
+              <w:t>0.285</w:t>
+            </w:r>
+          </w:p>
+        </w:tc>
+        <w:tc>
+          <w:tcPr>
+            <w:tcW w:type="dxa" w:w="1560"/>
+          </w:tcPr>
+          <w:p>
+            <w:r>
+              <w:t>28.4%</w:t>
+            </w:r>
+          </w:p>
+        </w:tc>
+        <w:tc>
+          <w:tcPr>
+            <w:tcW w:type="dxa" w:w="1560"/>
+          </w:tcPr>
+          <w:p>
+            <w:r>
+              <w:t>83.8%</w:t>
+            </w:r>
+          </w:p>
+        </w:tc>
+      </w:tr>
+      <w:tr>
+        <w:tc>
+          <w:tcPr>
+            <w:tcW w:type="dxa" w:w="1560"/>
+          </w:tcPr>
+          <w:p>
+            <w:r>
+              <w:t>Recommended (bge-m3 + llama3-chatqa)</w:t>
+            </w:r>
+          </w:p>
+        </w:tc>
+        <w:tc>
+          <w:tcPr>
+            <w:tcW w:type="dxa" w:w="1560"/>
+          </w:tcPr>
+          <w:p>
+            <w:r>
+              <w:t>Translated</w:t>
+            </w:r>
+          </w:p>
+        </w:tc>
+        <w:tc>
+          <w:tcPr>
+            <w:tcW w:type="dxa" w:w="1560"/>
+          </w:tcPr>
+          <w:p>
+            <w:r>
+              <w:t>0.125</w:t>
+            </w:r>
+          </w:p>
+        </w:tc>
+        <w:tc>
+          <w:tcPr>
+            <w:tcW w:type="dxa" w:w="1560"/>
+          </w:tcPr>
+          <w:p>
+            <w:r>
+              <w:t>0.281</w:t>
+            </w:r>
+          </w:p>
+        </w:tc>
+        <w:tc>
+          <w:tcPr>
+            <w:tcW w:type="dxa" w:w="1560"/>
+          </w:tcPr>
+          <w:p>
+            <w:r>
+              <w:t>31.1%</w:t>
+            </w:r>
+          </w:p>
+        </w:tc>
+        <w:tc>
+          <w:tcPr>
+            <w:tcW w:type="dxa" w:w="1560"/>
+          </w:tcPr>
+          <w:p>
+            <w:r>
+              <w:t>80.2%</w:t>
+            </w:r>
+          </w:p>
+        </w:tc>
+      </w:tr>
+    </w:tbl>
+    <w:p>
+      <w:pPr>
+        <w:pStyle w:val="FirstParagraph"/>
+      </w:pPr>
+      <w:r>
+        <w:rPr>
+          <w:b/>
+        </w:rPr>
+        <w:t>Table C.3: Error attribution (confusion matrix), 9 Bangla documents + IICTNotice.</w:t>
+      </w:r>
+    </w:p>
+    <w:tbl>
+      <w:tblPr>
+        <w:tblW w:type="auto" w:w="0"/>
+        <w:tblLook w:firstColumn="1" w:firstRow="1" w:lastColumn="0" w:lastRow="0" w:noHBand="0" w:noVBand="1" w:val="04A0"/>
+      </w:tblPr>
+      <w:tblGrid>
+        <w:gridCol w:w="1872"/>
+        <w:gridCol w:w="1872"/>
+        <w:gridCol w:w="1872"/>
+        <w:gridCol w:w="1872"/>
+        <w:gridCol w:w="1872"/>
+      </w:tblGrid>
+      <w:tr>
+        <w:tc>
+          <w:tcPr>
+            <w:tcW w:type="dxa" w:w="1872"/>
+          </w:tcPr>
+          <w:p>
+            <w:r>
+              <w:t>Configuration / criterion</w:t>
+            </w:r>
+          </w:p>
+        </w:tc>
+        <w:tc>
+          <w:tcPr>
+            <w:tcW w:type="dxa" w:w="1872"/>
+          </w:tcPr>
+          <w:p>
+            <w:r>
+              <w:t>Retrieval hit rate</w:t>
+            </w:r>
+          </w:p>
+        </w:tc>
+        <w:tc>
+          <w:tcPr>
+            <w:tcW w:type="dxa" w:w="1872"/>
+          </w:tcPr>
+          <w:p>
+            <w:r>
+              <w:t>Answer correct rate</w:t>
+            </w:r>
+          </w:p>
+        </w:tc>
+        <w:tc>
+          <w:tcPr>
+            <w:tcW w:type="dxa" w:w="1872"/>
+          </w:tcPr>
+          <w:p>
+            <w:r>
+              <w:t>Wrong due to retrieval miss</w:t>
+            </w:r>
+          </w:p>
+        </w:tc>
+        <w:tc>
+          <w:tcPr>
+            <w:tcW w:type="dxa" w:w="1872"/>
+          </w:tcPr>
+          <w:p>
+            <w:r>
+              <w:t>Wrong due to generation</w:t>
+            </w:r>
+          </w:p>
+        </w:tc>
+      </w:tr>
+      <w:tr>
+        <w:tc>
+          <w:tcPr>
+            <w:tcW w:type="dxa" w:w="1872"/>
+          </w:tcPr>
+          <w:p>
+            <w:r>
+              <w:t>Primary, Exact Match (n=1360)</w:t>
+            </w:r>
+          </w:p>
+        </w:tc>
+        <w:tc>
+          <w:tcPr>
+            <w:tcW w:type="dxa" w:w="1872"/>
+          </w:tcPr>
+          <w:p>
+            <w:r>
+              <w:t>67.7%</w:t>
+            </w:r>
+          </w:p>
+        </w:tc>
+        <w:tc>
+          <w:tcPr>
+            <w:tcW w:type="dxa" w:w="1872"/>
+          </w:tcPr>
+          <w:p>
+            <w:r>
+              <w:t>1.5%</w:t>
+            </w:r>
+          </w:p>
+        </w:tc>
+        <w:tc>
+          <w:tcPr>
+            <w:tcW w:type="dxa" w:w="1872"/>
+          </w:tcPr>
+          <w:p>
+            <w:r>
+              <w:t>32.7%</w:t>
+            </w:r>
+          </w:p>
+        </w:tc>
+        <w:tc>
+          <w:tcPr>
+            <w:tcW w:type="dxa" w:w="1872"/>
+          </w:tcPr>
+          <w:p>
+            <w:r>
+              <w:t>67.3%</w:t>
+            </w:r>
+          </w:p>
+        </w:tc>
+      </w:tr>
+      <w:tr>
+        <w:tc>
+          <w:tcPr>
+            <w:tcW w:type="dxa" w:w="1872"/>
+          </w:tcPr>
+          <w:p>
+            <w:r>
+              <w:t>Primary, F1&gt;=0.60 (n=1360)</w:t>
+            </w:r>
+          </w:p>
+        </w:tc>
+        <w:tc>
+          <w:tcPr>
+            <w:tcW w:type="dxa" w:w="1872"/>
+          </w:tcPr>
+          <w:p>
+            <w:r>
+              <w:t>67.7%</w:t>
+            </w:r>
+          </w:p>
+        </w:tc>
+        <w:tc>
+          <w:tcPr>
+            <w:tcW w:type="dxa" w:w="1872"/>
+          </w:tcPr>
+          <w:p>
+            <w:r>
+              <w:t>5.7%</w:t>
+            </w:r>
+          </w:p>
+        </w:tc>
+        <w:tc>
+          <w:tcPr>
+            <w:tcW w:type="dxa" w:w="1872"/>
+          </w:tcPr>
+          <w:p>
+            <w:r>
+              <w:t>33.6%</w:t>
+            </w:r>
+          </w:p>
+        </w:tc>
+        <w:tc>
+          <w:tcPr>
+            <w:tcW w:type="dxa" w:w="1872"/>
+          </w:tcPr>
+          <w:p>
+            <w:r>
+              <w:t>66.4%</w:t>
+            </w:r>
+          </w:p>
+        </w:tc>
+      </w:tr>
+      <w:tr>
+        <w:tc>
+          <w:tcPr>
+            <w:tcW w:type="dxa" w:w="1872"/>
+          </w:tcPr>
+          <w:p>
+            <w:r>
+              <w:t>Recommended, Exact Match (n=272)</w:t>
+            </w:r>
+          </w:p>
+        </w:tc>
+        <w:tc>
+          <w:tcPr>
+            <w:tcW w:type="dxa" w:w="1872"/>
+          </w:tcPr>
+          <w:p>
+            <w:r>
+              <w:t>82.0%</w:t>
+            </w:r>
+          </w:p>
+        </w:tc>
+        <w:tc>
+          <w:tcPr>
+            <w:tcW w:type="dxa" w:w="1872"/>
+          </w:tcPr>
+          <w:p>
+            <w:r>
+              <w:t>12.9%</w:t>
+            </w:r>
+          </w:p>
+        </w:tc>
+        <w:tc>
+          <w:tcPr>
+            <w:tcW w:type="dxa" w:w="1872"/>
+          </w:tcPr>
+          <w:p>
+            <w:r>
+              <w:t>19.4%</w:t>
+            </w:r>
+          </w:p>
+        </w:tc>
+        <w:tc>
+          <w:tcPr>
+            <w:tcW w:type="dxa" w:w="1872"/>
+          </w:tcPr>
+          <w:p>
+            <w:r>
+              <w:t>80.6%</w:t>
+            </w:r>
+          </w:p>
+        </w:tc>
+      </w:tr>
+      <w:tr>
+        <w:tc>
+          <w:tcPr>
+            <w:tcW w:type="dxa" w:w="1872"/>
+          </w:tcPr>
+          <w:p>
+            <w:r>
+              <w:t>Recommended, F1&gt;=0.60 (n=272)</w:t>
+            </w:r>
+          </w:p>
+        </w:tc>
+        <w:tc>
+          <w:tcPr>
+            <w:tcW w:type="dxa" w:w="1872"/>
+          </w:tcPr>
+          <w:p>
+            <w:r>
+              <w:t>82.0%</w:t>
+            </w:r>
+          </w:p>
+        </w:tc>
+        <w:tc>
+          <w:tcPr>
+            <w:tcW w:type="dxa" w:w="1872"/>
+          </w:tcPr>
+          <w:p>
+            <w:r>
+              <w:t>20.6%</w:t>
+            </w:r>
+          </w:p>
+        </w:tc>
+        <w:tc>
+          <w:tcPr>
+            <w:tcW w:type="dxa" w:w="1872"/>
+          </w:tcPr>
+          <w:p>
+            <w:r>
+              <w:t>21.3%</w:t>
+            </w:r>
+          </w:p>
+        </w:tc>
+        <w:tc>
+          <w:tcPr>
+            <w:tcW w:type="dxa" w:w="1872"/>
+          </w:tcPr>
+          <w:p>
+            <w:r>
+              <w:t>78.7%</w:t>
+            </w:r>
+          </w:p>
+        </w:tc>
+      </w:tr>
+    </w:tbl>
+    <w:p>
+      <w:pPr>
+        <w:pStyle w:val="FirstParagraph"/>
+      </w:pPr>
+      <w:r>
+        <w:t>Under the recommended pipeline (bge-m3 + llama3-chatqa), the answer-correct rate under this substitution (20.6% at F1&gt;=0.60) is noticeably higher than both the canonical pooled result (Table 5.4: 4.6%) and the canonical recommended-pipeline result (Table 5.4b: 12.7%). This confirms the same conclusion already reached in Section 5.7b through a different, complementary calculation: a large share of this system's remaining error is tied to retrieval scaling on long, dense, single documents, not to a ceiling on generation quality or to English-language handling. This appendix is reported for transparency and completeness; the numbers used throughout the main text, abstract, and conclusions of this thesis remain those of the canonical ten-document evaluation (Chapter 5), which includes DUETBooklet.</w:t>
+      </w:r>
+    </w:p>
+    <w:p>
+      <w:pPr>
+        <w:pStyle w:val="FirstParagraph"/>
+      </w:pPr>
+      <w:r>
+        <w:t>Source data: results/aggregate_full/no_duet_sensitivity.json, results/retrieval_eval_iict_notice.csv, results/generation_eval_iict_notice_*.csv, computed by scripts/analyze_no_duet_sensitivity.py.</w:t>
       </w:r>
     </w:p>
     <w:bookmarkEnd w:id="92"/>

</xml_diff>